<commit_message>
feat: complete tax template workflows and improve document scanning
</commit_message>
<xml_diff>
--- a/assets/templates/word/dependent_units/ddkd_terminate/1. Thông báo chấm dứt hoạt động.docx
+++ b/assets/templates/word/dependent_units/ddkd_terminate/1. Thông báo chấm dứt hoạt động.docx
@@ -330,8 +330,19 @@
                 <w:color w:val="000000"/>
                 <w:sz w:val="25"/>
                 <w:szCs w:val="25"/>
-              </w:rPr>
-              <w:t xml:space="preserve">Thành phố Hồ Chí Minh, ngày </w:t>
+                <w:highlight w:val="green"/>
+              </w:rPr>
+              <w:t xml:space="preserve">Thành phố Hồ Chí Minh</w:t>
+            </w:r>
+            <w:r>
+              <w:rPr>
+                <w:rFonts w:eastAsia="Calibri" w:cs="Times New Roman" w:ascii="Times New Roman" w:hAnsi="Times New Roman"/>
+                <w:i/>
+                <w:color w:val="000000"/>
+                <w:sz w:val="25"/>
+                <w:szCs w:val="25"/>
+              </w:rPr>
+              <w:t xml:space="preserve">, ngày </w:t>
             </w:r>
             <w:r>
               <w:rPr>
@@ -556,7 +567,17 @@
           <w:sz w:val="25"/>
           <w:szCs w:val="25"/>
         </w:rPr>
-        <w:t>Kính gửi: Phòng Đăng ký kinh doanh Thành phố Hồ Chí Minh</w:t>
+        <w:t xml:space="preserve">Kính gửi: </w:t>
+      </w:r>
+      <w:r>
+        <w:rPr>
+          <w:rFonts w:eastAsia="Calibri" w:cs="Times New Roman" w:ascii="Times New Roman" w:hAnsi="Times New Roman"/>
+          <w:color w:val="000000"/>
+          <w:sz w:val="25"/>
+          <w:szCs w:val="25"/>
+          <w:highlight w:val="green"/>
+        </w:rPr>
+        <w:t xml:space="preserve">Phòng Đăng ký kinh doanh Thành phố Hồ Chí Minh</w:t>
       </w:r>
     </w:p>
     <w:p>

</xml_diff>